<commit_message>
docs(msc-mapping): confirme Jira, Clarity PPM, Gantt, Microsoft 365 (03/07/2026) — reclassés couverts/partiellement couverts
</commit_message>
<xml_diff>
--- a/docs/Mapping competences MSc Management 42Impact.docx
+++ b/docs/Mapping competences MSc Management 42Impact.docx
@@ -1356,7 +1356,7 @@
                 <w:sz w:val="18"/>
                 <w:szCs w:val="18"/>
               </w:rPr>
-              <w:t xml:space="preserve">Non couvert / non revendiqué — outils non explicitement mentionnés dans les missions documentées</w:t>
+              <w:t xml:space="preserve">Partiellement couvert — Jira et Clarity PPM confirmés par Céline (03/07/2026) ; Salesforce, SAP, Oracle et Confluence non confirmés</w:t>
             </w:r>
           </w:p>
         </w:tc>
@@ -1472,7 +1472,7 @@
                 <w:sz w:val="18"/>
                 <w:szCs w:val="18"/>
               </w:rPr>
-              <w:t xml:space="preserve">Non couvert / non revendiqué — probable dans la pratique du pilotage projet, mais non explicitement documenté</w:t>
+              <w:t xml:space="preserve">Partiellement couvert — planning Gantt confirmé par Céline (03/07/2026) ; PERT non confirmé</w:t>
             </w:r>
           </w:p>
         </w:tc>
@@ -1588,7 +1588,7 @@
                 <w:sz w:val="18"/>
                 <w:szCs w:val="18"/>
               </w:rPr>
-              <w:t xml:space="preserve">Partiellement couvert — usage implicite pour le reporting KPI, non explicitement mentionné</w:t>
+              <w:t xml:space="preserve">Couvert et démontrable — Microsoft 365 confirmé par Céline (03/07/2026)</w:t>
             </w:r>
           </w:p>
         </w:tc>
@@ -1715,7 +1715,7 @@
         <w:spacing w:before="100"/>
       </w:pPr>
       <w:r>
-        <w:t xml:space="preserve">Ce tableau est délibérément prudent : plusieurs outils cités dans le référentiel métier (CRM, ERP, PERT/GANTT, contrôle de gestion) ne figurent pas explicitement dans les missions décrites au CV ou dans l'attestation BPCE. Avant intégration définitive au dossier envoyé à l'école, il serait utile de vérifier avec Céline lesquels de ces outils ont réellement été utilisés.</w:t>
+        <w:t xml:space="preserve">Mise à jour du 03/07/2026 : Céline a confirmé l'usage réel de Jira, Clarity PPM, du planning Gantt et de Microsoft 365 (Excel/PowerPoint), reclassés en conséquence ci-dessus. Restent non confirmés : Salesforce, SAP, Oracle, Confluence, la méthode PERT, ainsi que les outils de gestion budgétaire et de contrôle de gestion.</w:t>
       </w:r>
     </w:p>
     <w:p>
@@ -2753,7 +2753,7 @@
                 <w:sz w:val="18"/>
                 <w:szCs w:val="18"/>
               </w:rPr>
-              <w:t xml:space="preserve">Majoritairement non couvert / non revendiqué</w:t>
+              <w:t xml:space="preserve">Partiellement couvert (Jira, Clarity PPM, Gantt, Microsoft 365 confirmés)</w:t>
             </w:r>
           </w:p>
         </w:tc>
@@ -3229,7 +3229,7 @@
         <w:spacing w:after="160"/>
       </w:pPr>
       <w:r>
-        <w:t xml:space="preserve">Ce mapping reste honnête sur ses limites : plusieurs outils techniques cités dans le référentiel métier PMO (CRM, ERP, PERT/GANTT, contrôle de gestion) ne sont pas confirmés par les missions documentées, et la dimension stratégique de plus haut niveau (D51.1, D51.2) relève partiellement d'un niveau hiérarchique que le poste occupé ne couvre pas entièrement.</w:t>
+        <w:t xml:space="preserve">Ce mapping reste honnête sur ses limites : Jira, Clarity PPM, le planning Gantt et Microsoft 365 sont désormais confirmés (03/07/2026), mais Salesforce, SAP, Oracle, Confluence, la méthode PERT et les outils de contrôle de gestion budgétaire ne le sont pas. La dimension stratégique de plus haut niveau (D51.1, D51.2) relève par ailleurs partiellement d'un niveau hiérarchique que le poste occupé ne couvre pas entièrement.</w:t>
       </w:r>
     </w:p>
     <w:p>

</xml_diff>